<commit_message>
Use per-template short IDs in the DOD sequence document
Keys in the selection key syntax. The sections of the VAV boxes read the
values of their template only; the fan-powered section combines both
fan-powered templates with OR. Fix the electric heat toggle split by a
comment reference.
</commit_message>
<xml_diff>
--- a/server/scripts/sequence-doc/src/version/DOD_20260828/sequenceWithTags.docx
+++ b/server/scripts/sequence-doc/src/version/DOD_20260828/sequenceWithTags.docx
@@ -238,7 +238,7 @@
         <w:rPr>
           <w:rStyle w:val="Toggle"/>
         </w:rPr>
-        <w:t>[YES NC]</w:t>
+        <w:t>[YES NC_CO]</w:t>
       </w:r>
       <w:r>
         <w:t xml:space="preserve">‘Need Cool’ Request </w:t>
@@ -790,7 +790,7 @@
         <w:rPr>
           <w:rStyle w:val="Toggle"/>
         </w:rPr>
-        <w:t>[YES NC]</w:t>
+        <w:t>[YES NC_RH]</w:t>
       </w:r>
       <w:r>
         <w:rPr>
@@ -846,7 +846,7 @@
         <w:rPr>
           <w:rStyle w:val="Toggle"/>
         </w:rPr>
-        <w:t>[YES NH]</w:t>
+        <w:t>[YES NH_RH]</w:t>
       </w:r>
       <w:r>
         <w:rPr>
@@ -1155,7 +1155,7 @@
         <w:rPr>
           <w:rStyle w:val="Toggle"/>
         </w:rPr>
-        <w:t>[EQUALS TERM_HT HW]</w:t>
+        <w:t>[EQUALS TERM_HT_RH HW]</w:t>
       </w:r>
       <w:r>
         <w:rPr>
@@ -1211,7 +1211,7 @@
         <w:rPr>
           <w:rStyle w:val="Toggle"/>
         </w:rPr>
-        <w:t xml:space="preserve">[EQUALS TERM_HT </w:t>
+        <w:t xml:space="preserve">[EQUALS TERM_HT_RH </w:t>
       </w:r>
       <w:commentRangeStart w:id="1"/>
       <w:r>
@@ -1221,6 +1221,12 @@
         <w:t>ELEC</w:t>
       </w:r>
       <w:commentRangeEnd w:id="1"/>
+      <w:r>
+        <w:rPr>
+          <w:rStyle w:val="Toggle"/>
+        </w:rPr>
+        <w:t>]</w:t>
+      </w:r>
       <w:r>
         <w:rPr>
           <w:rStyle w:val="CommentReference"/>
@@ -1229,12 +1235,6 @@
           <w:szCs w:val="24"/>
         </w:rPr>
         <w:commentReference w:id="1"/>
-      </w:r>
-      <w:r>
-        <w:rPr>
-          <w:rStyle w:val="Toggle"/>
-        </w:rPr>
-        <w:t>]</w:t>
       </w:r>
       <w:r>
         <w:rPr>
@@ -1706,7 +1706,7 @@
         <w:rPr>
           <w:rStyle w:val="Toggle"/>
         </w:rPr>
-        <w:t>[YES NC]</w:t>
+        <w:t>[OR [YES NC_PFBCV] [YES NC_SFBCV]]</w:t>
       </w:r>
       <w:r>
         <w:rPr>
@@ -1762,7 +1762,7 @@
         <w:rPr>
           <w:rStyle w:val="Toggle"/>
         </w:rPr>
-        <w:t>[YES NH]</w:t>
+        <w:t>[OR [YES NH_PFBCV] [YES NH_SFBCV]]</w:t>
       </w:r>
       <w:r>
         <w:rPr>
@@ -2085,7 +2085,7 @@
         <w:rPr>
           <w:rStyle w:val="Toggle"/>
         </w:rPr>
-        <w:t>[EQUALS TERM_HT HW]</w:t>
+        <w:t>[OR [EQUALS TERM_HT_PFBCV HW] [EQUALS TERM_HT_SFBCV HW]]</w:t>
       </w:r>
       <w:r>
         <w:rPr>
@@ -2141,7 +2141,7 @@
         <w:rPr>
           <w:rStyle w:val="Toggle"/>
         </w:rPr>
-        <w:t>[EQUALS TERM_HT ELEC]</w:t>
+        <w:t>[OR [EQUALS TERM_HT_PFBCV ELEC] [EQUALS TERM_HT_SFBCV ELEC]]</w:t>
       </w:r>
       <w:r>
         <w:rPr>

</xml_diff>

<commit_message>
Number the headings of the DOD sequence document automatically
</commit_message>
<xml_diff>
--- a/server/scripts/sequence-doc/src/version/DOD_20260828/sequenceWithTags.docx
+++ b/server/scripts/sequence-doc/src/version/DOD_20260828/sequenceWithTags.docx
@@ -6,9 +6,6 @@
       <w:pPr>
         <w:pStyle w:val="Heading3"/>
       </w:pPr>
-      <w:r>
-        <w:t xml:space="preserve">3.2.3 </w:t>
-      </w:r>
       <w:r>
         <w:rPr>
           <w:rStyle w:val="Toggle"/>
@@ -163,7 +160,7 @@
         <w:pStyle w:val="Heading4"/>
       </w:pPr>
       <w:r>
-        <w:t xml:space="preserve">3.2.3.1 Zone Temperature Control </w:t>
+        <w:t xml:space="preserve">Zone Temperature Control </w:t>
       </w:r>
     </w:p>
     <w:p>
@@ -180,13 +177,7 @@
         <w:pStyle w:val="Heading5"/>
       </w:pPr>
       <w:r>
-        <w:t>3.2.3.1</w:t>
-      </w:r>
-      <w:r>
-        <w:t>.1</w:t>
-      </w:r>
-      <w:r>
-        <w:t xml:space="preserve"> Temperature Setpoint </w:t>
+        <w:t xml:space="preserve">Temperature Setpoint </w:t>
       </w:r>
     </w:p>
     <w:p>
@@ -226,15 +217,6 @@
         <w:pStyle w:val="Heading5"/>
       </w:pPr>
       <w:r>
-        <w:t>3.2.3.1</w:t>
-      </w:r>
-      <w:r>
-        <w:t>.2</w:t>
-      </w:r>
-      <w:r>
-        <w:t xml:space="preserve"> </w:t>
-      </w:r>
-      <w:r>
         <w:rPr>
           <w:rStyle w:val="Toggle"/>
         </w:rPr>
@@ -282,7 +264,7 @@
         <w:pStyle w:val="Heading4"/>
       </w:pPr>
       <w:r>
-        <w:t xml:space="preserve">3.2.3.2 Zone Airflow Control </w:t>
+        <w:t xml:space="preserve">Zone Airflow Control </w:t>
       </w:r>
     </w:p>
     <w:p>
@@ -299,7 +281,7 @@
         <w:pStyle w:val="Heading5"/>
       </w:pPr>
       <w:r>
-        <w:t xml:space="preserve">3.2.3.2.1 Airflow Setpoint </w:t>
+        <w:t xml:space="preserve">Airflow Setpoint </w:t>
       </w:r>
     </w:p>
     <w:p>
@@ -339,13 +321,7 @@
         <w:pStyle w:val="Heading5"/>
       </w:pPr>
       <w:r>
-        <w:t>3.2.3.2</w:t>
-      </w:r>
-      <w:r>
-        <w:t>.2</w:t>
-      </w:r>
-      <w:r>
-        <w:t xml:space="preserve"> Primary Air Damper </w:t>
+        <w:t xml:space="preserve">Primary Air Damper </w:t>
       </w:r>
     </w:p>
     <w:p>
@@ -384,9 +360,6 @@
       <w:pPr>
         <w:pStyle w:val="Heading3"/>
       </w:pPr>
-      <w:r>
-        <w:t xml:space="preserve">3.2.4 </w:t>
-      </w:r>
       <w:r>
         <w:rPr>
           <w:rStyle w:val="Toggle"/>
@@ -594,7 +567,7 @@
         <w:pStyle w:val="Heading4"/>
       </w:pPr>
       <w:r>
-        <w:t xml:space="preserve">3.2.4.1 Zone Temperature Control </w:t>
+        <w:t xml:space="preserve">Zone Temperature Control </w:t>
       </w:r>
     </w:p>
     <w:p>
@@ -611,7 +584,7 @@
         <w:pStyle w:val="Heading5"/>
       </w:pPr>
       <w:r>
-        <w:t xml:space="preserve">3.2.4.1.1 Temperature Setpoint </w:t>
+        <w:t xml:space="preserve">Temperature Setpoint </w:t>
       </w:r>
     </w:p>
     <w:p>
@@ -784,9 +757,6 @@
         <w:pStyle w:val="Heading5"/>
       </w:pPr>
       <w:r>
-        <w:t xml:space="preserve">3.2.4.1.2 </w:t>
-      </w:r>
-      <w:r>
         <w:rPr>
           <w:rStyle w:val="Toggle"/>
         </w:rPr>
@@ -840,9 +810,6 @@
         <w:pStyle w:val="Heading5"/>
       </w:pPr>
       <w:r>
-        <w:t xml:space="preserve">3.2.4.1.3 </w:t>
-      </w:r>
-      <w:r>
         <w:rPr>
           <w:rStyle w:val="Toggle"/>
         </w:rPr>
@@ -895,7 +862,7 @@
         <w:pStyle w:val="Heading4"/>
       </w:pPr>
       <w:r>
-        <w:t xml:space="preserve">3.2.4.2 Zone Airflow Control </w:t>
+        <w:t xml:space="preserve">Zone Airflow Control </w:t>
       </w:r>
     </w:p>
     <w:p>
@@ -912,7 +879,7 @@
         <w:pStyle w:val="Heading5"/>
       </w:pPr>
       <w:r>
-        <w:t xml:space="preserve">3.2.4.2.1 Airflow Setpoint </w:t>
+        <w:t xml:space="preserve">Airflow Setpoint </w:t>
       </w:r>
     </w:p>
     <w:p>
@@ -989,7 +956,7 @@
         <w:pStyle w:val="Heading5"/>
       </w:pPr>
       <w:r>
-        <w:t xml:space="preserve">3.2.4.2.2 Primary Air Damper </w:t>
+        <w:t xml:space="preserve">Primary Air Damper </w:t>
       </w:r>
     </w:p>
     <w:p>
@@ -1031,7 +998,7 @@
       </w:pPr>
       <w:commentRangeStart w:id="0"/>
       <w:r>
-        <w:t xml:space="preserve">3.2.4.2.3 Cool Mode </w:t>
+        <w:t xml:space="preserve">Cool Mode </w:t>
       </w:r>
       <w:commentRangeEnd w:id="0"/>
       <w:r>
@@ -1092,7 +1059,7 @@
         <w:pStyle w:val="Heading5"/>
       </w:pPr>
       <w:r>
-        <w:t xml:space="preserve">3.2.4.2.4 Heat Mode </w:t>
+        <w:t xml:space="preserve">Heat Mode </w:t>
       </w:r>
     </w:p>
     <w:p>
@@ -1132,7 +1099,7 @@
         <w:pStyle w:val="Heading4"/>
       </w:pPr>
       <w:r>
-        <w:t xml:space="preserve">3.2.4.3 Heating Control </w:t>
+        <w:t xml:space="preserve">Heating Control </w:t>
       </w:r>
     </w:p>
     <w:p>
@@ -1149,9 +1116,6 @@
         <w:pStyle w:val="Heading5"/>
       </w:pPr>
       <w:r>
-        <w:t xml:space="preserve">3.2.4.3.1 </w:t>
-      </w:r>
-      <w:r>
         <w:rPr>
           <w:rStyle w:val="Toggle"/>
         </w:rPr>
@@ -1204,9 +1168,6 @@
       <w:pPr>
         <w:pStyle w:val="Heading5"/>
       </w:pPr>
-      <w:r>
-        <w:t xml:space="preserve">3.2.4.3.2 </w:t>
-      </w:r>
       <w:r>
         <w:rPr>
           <w:rStyle w:val="Toggle"/>
@@ -1282,9 +1243,6 @@
       <w:pPr>
         <w:pStyle w:val="Heading3"/>
       </w:pPr>
-      <w:r>
-        <w:t xml:space="preserve">3.2.5 </w:t>
-      </w:r>
       <w:r>
         <w:rPr>
           <w:rStyle w:val="Toggle"/>
@@ -1524,10 +1482,27 @@
     </w:p>
     <w:p>
       <w:pPr>
+        <w:pStyle w:val="Heading4"/>
+      </w:pPr>
+      <w:r>
+        <w:t xml:space="preserve">Zone Temperature Control </w:t>
+      </w:r>
+    </w:p>
+    <w:p>
+      <w:pPr>
+        <w:spacing w:after="0" w:line="240" w:lineRule="auto"/>
+        <w:ind w:left="720"/>
+        <w:rPr>
+          <w:rFonts w:ascii="Times New Roman" w:hAnsi="Times New Roman" w:cs="Times New Roman"/>
+        </w:rPr>
+      </w:pPr>
+    </w:p>
+    <w:p>
+      <w:pPr>
         <w:pStyle w:val="Heading5"/>
       </w:pPr>
       <w:r>
-        <w:t xml:space="preserve">3.2.5.1.1 Temperature Setpoint </w:t>
+        <w:t xml:space="preserve">Temperature Setpoint </w:t>
       </w:r>
     </w:p>
     <w:p>
@@ -1700,9 +1675,6 @@
         <w:pStyle w:val="Heading5"/>
       </w:pPr>
       <w:r>
-        <w:t xml:space="preserve">3.2.5.1.2 </w:t>
-      </w:r>
-      <w:r>
         <w:rPr>
           <w:rStyle w:val="Toggle"/>
         </w:rPr>
@@ -1756,9 +1728,6 @@
         <w:pStyle w:val="Heading5"/>
       </w:pPr>
       <w:r>
-        <w:t xml:space="preserve">3.2.5.1.3 </w:t>
-      </w:r>
-      <w:r>
         <w:rPr>
           <w:rStyle w:val="Toggle"/>
         </w:rPr>
@@ -1811,7 +1780,7 @@
         <w:pStyle w:val="Heading4"/>
       </w:pPr>
       <w:r>
-        <w:t xml:space="preserve">3.2.5.2 Zone Airflow Control </w:t>
+        <w:t xml:space="preserve">Zone Airflow Control </w:t>
       </w:r>
     </w:p>
     <w:p>
@@ -1828,7 +1797,7 @@
         <w:pStyle w:val="Heading5"/>
       </w:pPr>
       <w:r>
-        <w:t xml:space="preserve">3.2.5.2.1 Airflow Setpoint </w:t>
+        <w:t xml:space="preserve">Airflow Setpoint </w:t>
       </w:r>
     </w:p>
     <w:p>
@@ -1906,7 +1875,7 @@
         <w:pStyle w:val="Heading5"/>
       </w:pPr>
       <w:r>
-        <w:t xml:space="preserve">3.2.5.2.2 Primary Air Damper </w:t>
+        <w:t xml:space="preserve">Primary Air Damper </w:t>
       </w:r>
     </w:p>
     <w:p>
@@ -1948,7 +1917,7 @@
       </w:pPr>
       <w:commentRangeStart w:id="2"/>
       <w:r>
-        <w:t xml:space="preserve">3.2.5.2.3 Cool Mode </w:t>
+        <w:t xml:space="preserve">Cool Mode </w:t>
       </w:r>
       <w:commentRangeEnd w:id="2"/>
       <w:r>
@@ -2022,7 +1991,7 @@
         <w:pStyle w:val="Heading5"/>
       </w:pPr>
       <w:r>
-        <w:t xml:space="preserve">3.2.5.2.4 Heat Mode </w:t>
+        <w:t xml:space="preserve">Heat Mode </w:t>
       </w:r>
     </w:p>
     <w:p>
@@ -2062,7 +2031,7 @@
         <w:pStyle w:val="Heading4"/>
       </w:pPr>
       <w:r>
-        <w:t xml:space="preserve">3.2.5.3 Heating Control </w:t>
+        <w:t xml:space="preserve">Heating Control </w:t>
       </w:r>
     </w:p>
     <w:p>
@@ -2079,9 +2048,6 @@
         <w:pStyle w:val="Heading5"/>
       </w:pPr>
       <w:r>
-        <w:t xml:space="preserve">3.2.5.3.1 </w:t>
-      </w:r>
-      <w:r>
         <w:rPr>
           <w:rStyle w:val="Toggle"/>
         </w:rPr>
@@ -2135,9 +2101,6 @@
         <w:pStyle w:val="Heading5"/>
       </w:pPr>
       <w:r>
-        <w:t xml:space="preserve">3.2.5.3.2 </w:t>
-      </w:r>
-      <w:r>
         <w:rPr>
           <w:rStyle w:val="Toggle"/>
         </w:rPr>
@@ -2190,7 +2153,7 @@
         <w:pStyle w:val="Heading4"/>
       </w:pPr>
       <w:r>
-        <w:t xml:space="preserve">3.2.5.4 Fan Control </w:t>
+        <w:t xml:space="preserve">Fan Control </w:t>
       </w:r>
     </w:p>
     <w:p>
@@ -2206,9 +2169,6 @@
       <w:pPr>
         <w:pStyle w:val="Heading5"/>
       </w:pPr>
-      <w:r>
-        <w:t xml:space="preserve">3.2.5.4.1 </w:t>
-      </w:r>
       <w:r>
         <w:rPr>
           <w:rStyle w:val="Toggle"/>
@@ -2266,9 +2226,6 @@
         <w:pStyle w:val="Heading5"/>
       </w:pPr>
       <w:r>
-        <w:t xml:space="preserve">3.2.5.4.2 </w:t>
-      </w:r>
-      <w:r>
         <w:rPr>
           <w:rStyle w:val="Toggle"/>
         </w:rPr>
@@ -2322,13 +2279,7 @@
         <w:pStyle w:val="Heading5"/>
       </w:pPr>
       <w:r>
-        <w:t>3.2.5.4.</w:t>
-      </w:r>
-      <w:r>
-        <w:t>3</w:t>
-      </w:r>
-      <w:r>
-        <w:t xml:space="preserve"> Proof </w:t>
+        <w:t xml:space="preserve">Proof </w:t>
       </w:r>
     </w:p>
     <w:p>
@@ -3675,11 +3626,63 @@
       </w:rPr>
     </w:lvl>
   </w:abstractNum>
+  <w:abstractNum w:abstractNumId="2">
+    <w:multiLevelType w:val="multilevel"/>
+    <w:lvl w:ilvl="0">
+      <w:start w:val="1"/>
+      <w:numFmt w:val="decimal"/>
+      <w:suff w:val="space"/>
+      <w:lvlText w:val="%1"/>
+      <w:lvlJc w:val="left"/>
+    </w:lvl>
+    <w:lvl w:ilvl="1">
+      <w:start w:val="1"/>
+      <w:numFmt w:val="decimal"/>
+      <w:suff w:val="space"/>
+      <w:lvlText w:val="%1.%2"/>
+      <w:lvlJc w:val="left"/>
+    </w:lvl>
+    <w:lvl w:ilvl="2">
+      <w:start w:val="3"/>
+      <w:numFmt w:val="decimal"/>
+      <w:pStyle w:val="Heading3"/>
+      <w:suff w:val="space"/>
+      <w:lvlText w:val="3.2.%3"/>
+      <w:lvlJc w:val="left"/>
+    </w:lvl>
+    <w:lvl w:ilvl="3">
+      <w:start w:val="1"/>
+      <w:numFmt w:val="decimal"/>
+      <w:pStyle w:val="Heading4"/>
+      <w:suff w:val="space"/>
+      <w:lvlText w:val="3.2.%3.%4"/>
+      <w:lvlJc w:val="left"/>
+    </w:lvl>
+    <w:lvl w:ilvl="4">
+      <w:start w:val="1"/>
+      <w:numFmt w:val="decimal"/>
+      <w:pStyle w:val="Heading5"/>
+      <w:suff w:val="space"/>
+      <w:lvlText w:val="3.2.%3.%4.%5"/>
+      <w:lvlJc w:val="left"/>
+    </w:lvl>
+    <w:lvl w:ilvl="5">
+      <w:start w:val="1"/>
+      <w:numFmt w:val="decimal"/>
+      <w:pStyle w:val="Heading6"/>
+      <w:suff w:val="space"/>
+      <w:lvlText w:val="3.2.%3.%4.%5.%6"/>
+      <w:lvlJc w:val="left"/>
+    </w:lvl>
+  </w:abstractNum>
   <w:num w:numId="1" w16cid:durableId="705954757">
     <w:abstractNumId w:val="0"/>
   </w:num>
   <w:num w:numId="2" w16cid:durableId="1729037388">
     <w:abstractNumId w:val="1"/>
+  </w:num>
+  <w:num w:numId="3">
+    <w:abstractNumId w:val="2"/>
   </w:num>
 </w:numbering>
 </file>
@@ -4150,6 +4153,10 @@
     <w:qFormat/>
     <w:rsid w:val="008150E3"/>
     <w:pPr>
+      <w:numPr>
+        <w:ilvl w:val="2"/>
+        <w:numId w:val="3"/>
+      </w:numPr>
       <w:spacing w:after="0" w:line="240" w:lineRule="auto"/>
       <w:outlineLvl w:val="2"/>
     </w:pPr>
@@ -4167,6 +4174,10 @@
     <w:qFormat/>
     <w:rsid w:val="008150E3"/>
     <w:pPr>
+      <w:numPr>
+        <w:ilvl w:val="3"/>
+        <w:numId w:val="3"/>
+      </w:numPr>
       <w:spacing w:after="0" w:line="240" w:lineRule="auto"/>
       <w:ind w:left="720"/>
       <w:outlineLvl w:val="3"/>
@@ -4185,6 +4196,10 @@
     <w:qFormat/>
     <w:rsid w:val="008150E3"/>
     <w:pPr>
+      <w:numPr>
+        <w:ilvl w:val="4"/>
+        <w:numId w:val="3"/>
+      </w:numPr>
       <w:spacing w:after="0" w:line="240" w:lineRule="auto"/>
       <w:ind w:left="1440"/>
       <w:outlineLvl w:val="4"/>
@@ -4206,6 +4221,10 @@
     <w:pPr>
       <w:keepNext/>
       <w:keepLines/>
+      <w:numPr>
+        <w:ilvl w:val="5"/>
+        <w:numId w:val="3"/>
+      </w:numPr>
       <w:spacing w:before="40" w:after="0"/>
       <w:outlineLvl w:val="5"/>
     </w:pPr>

</xml_diff>